<commit_message>
modify cv portefolio link to point to the right portefolio section
</commit_message>
<xml_diff>
--- a/Soc/assets/docs/CV-DJIBO-Mamadou-EN.docx
+++ b/Soc/assets/docs/CV-DJIBO-Mamadou-EN.docx
@@ -148,7 +148,7 @@
           </mc:Choice>
           <mc:Fallback>
             <w:pict>
-              <v:shape w14:anchorId="0B9957EC" id="Graphic 1" o:spid="_x0000_s1026" style="position:absolute;margin-left:35.45pt;margin-top:6.4pt;width:523.7pt;height:.1pt;z-index:-251674624;visibility:visible;mso-wrap-style:square;mso-wrap-distance-left:0;mso-wrap-distance-top:0;mso-wrap-distance-right:0;mso-wrap-distance-bottom:0;mso-position-horizontal:absolute;mso-position-horizontal-relative:page;mso-position-vertical:absolute;mso-position-vertical-relative:text;v-text-anchor:top" coordsize="6650990,1270" o:gfxdata="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" path="m,l6650426,e" filled="f" strokecolor="#1d1d1d" strokeweight=".26456mm">
+              <v:shape w14:anchorId="1846860D" id="Graphic 1" o:spid="_x0000_s1026" style="position:absolute;margin-left:35.45pt;margin-top:6.4pt;width:523.7pt;height:.1pt;z-index:-251674624;visibility:visible;mso-wrap-style:square;mso-wrap-distance-left:0;mso-wrap-distance-top:0;mso-wrap-distance-right:0;mso-wrap-distance-bottom:0;mso-position-horizontal:absolute;mso-position-horizontal-relative:page;mso-position-vertical:absolute;mso-position-vertical-relative:text;v-text-anchor:top" coordsize="6650990,1270" o:gfxdata="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" path="m,l6650426,e" filled="f" strokecolor="#1d1d1d" strokeweight=".26456mm">
                 <v:path arrowok="t"/>
                 <w10:wrap type="topAndBottom" anchorx="page"/>
               </v:shape>
@@ -262,7 +262,6 @@
         <w:t xml:space="preserve"> </w:t>
       </w:r>
       <w:hyperlink r:id="rId6" w:history="1">
-        <w:proofErr w:type="gramStart"/>
         <w:r>
           <w:rPr>
             <w:rStyle w:val="Lienhypertexte"/>
@@ -270,7 +269,6 @@
           </w:rPr>
           <w:t>LinkedIn:</w:t>
         </w:r>
-        <w:proofErr w:type="gramEnd"/>
         <w:r>
           <w:rPr>
             <w:rStyle w:val="Lienhypertexte"/>
@@ -392,7 +390,7 @@
           </mc:Choice>
           <mc:Fallback>
             <w:pict>
-              <v:shape w14:anchorId="37624240" id="Graphic 2" o:spid="_x0000_s1026" style="position:absolute;margin-left:35.45pt;margin-top:1.85pt;width:523.7pt;height:.1pt;z-index:-251670528;visibility:visible;mso-wrap-style:square;mso-wrap-distance-left:0;mso-wrap-distance-top:0;mso-wrap-distance-right:0;mso-wrap-distance-bottom:0;mso-position-horizontal:absolute;mso-position-horizontal-relative:page;mso-position-vertical:absolute;mso-position-vertical-relative:text;v-text-anchor:top" coordsize="6650990,1270" o:gfxdata="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" path="m,l6650426,e" filled="f" strokecolor="#1d1d1d" strokeweight=".26456mm">
+              <v:shape w14:anchorId="3876D452" id="Graphic 2" o:spid="_x0000_s1026" style="position:absolute;margin-left:35.45pt;margin-top:1.85pt;width:523.7pt;height:.1pt;z-index:-251670528;visibility:visible;mso-wrap-style:square;mso-wrap-distance-left:0;mso-wrap-distance-top:0;mso-wrap-distance-right:0;mso-wrap-distance-bottom:0;mso-position-horizontal:absolute;mso-position-horizontal-relative:page;mso-position-vertical:absolute;mso-position-vertical-relative:text;v-text-anchor:top" coordsize="6650990,1270" o:gfxdata="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" path="m,l6650426,e" filled="f" strokecolor="#1d1d1d" strokeweight=".26456mm">
                 <v:path arrowok="t"/>
                 <w10:wrap type="topAndBottom" anchorx="page"/>
               </v:shape>
@@ -547,7 +545,7 @@
           </mc:Choice>
           <mc:Fallback>
             <w:pict>
-              <v:group w14:anchorId="7982BE05" id="Group 3" o:spid="_x0000_s1026" style="width:523.7pt;height:.75pt;mso-position-horizontal-relative:char;mso-position-vertical-relative:line" coordsize="66509,95" o:gfxdata="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">
+              <v:group w14:anchorId="6FF3C137" id="Group 3" o:spid="_x0000_s1026" style="width:523.7pt;height:.75pt;mso-position-horizontal-relative:char;mso-position-vertical-relative:line" coordsize="66509,95" o:gfxdata="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">
                 <v:shape id="Graphic 4" o:spid="_x0000_s1027" style="position:absolute;top:47;width:66509;height:13;visibility:visible;mso-wrap-style:square;v-text-anchor:top" coordsize="6650990,1270" o:gfxdata="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" path="m,l6650426,e" filled="f" strokecolor="#1d1d1d" strokeweight=".26456mm">
                   <v:path arrowok="t"/>
                 </v:shape>
@@ -854,7 +852,7 @@
           </mc:Choice>
           <mc:Fallback>
             <w:pict>
-              <v:shape w14:anchorId="13FB5801" id="Graphic 8" o:spid="_x0000_s1026" style="position:absolute;margin-left:35.45pt;margin-top:17.9pt;width:523.65pt;height:.1pt;z-index:-251662336;visibility:visible;mso-wrap-style:square;mso-wrap-distance-left:0;mso-wrap-distance-top:0;mso-wrap-distance-right:0;mso-wrap-distance-bottom:0;mso-position-horizontal:absolute;mso-position-horizontal-relative:page;mso-position-vertical:absolute;mso-position-vertical-relative:text;v-text-anchor:top" coordsize="6650355,1270" o:gfxdata="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" path="m,l6650352,e" filled="f" strokecolor="#1d1d1d" strokeweight=".26456mm">
+              <v:shape w14:anchorId="4D27036E" id="Graphic 8" o:spid="_x0000_s1026" style="position:absolute;margin-left:35.45pt;margin-top:17.9pt;width:523.65pt;height:.1pt;z-index:-251662336;visibility:visible;mso-wrap-style:square;mso-wrap-distance-left:0;mso-wrap-distance-top:0;mso-wrap-distance-right:0;mso-wrap-distance-bottom:0;mso-position-horizontal:absolute;mso-position-horizontal-relative:page;mso-position-vertical:absolute;mso-position-vertical-relative:text;v-text-anchor:top" coordsize="6650355,1270" o:gfxdata="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" path="m,l6650352,e" filled="f" strokecolor="#1d1d1d" strokeweight=".26456mm">
                 <v:path arrowok="t"/>
                 <w10:wrap type="topAndBottom" anchorx="page"/>
               </v:shape>
@@ -1834,7 +1832,7 @@
           </mc:Choice>
           <mc:Fallback>
             <w:pict>
-              <v:shape w14:anchorId="3B48BC45" id="Graphic 27" o:spid="_x0000_s1026" style="position:absolute;margin-left:36.85pt;margin-top:4.75pt;width:523.7pt;height:.1pt;z-index:-251657728;visibility:visible;mso-wrap-style:square;mso-wrap-distance-left:0;mso-wrap-distance-top:0;mso-wrap-distance-right:0;mso-wrap-distance-bottom:0;mso-position-horizontal:absolute;mso-position-horizontal-relative:page;mso-position-vertical:absolute;mso-position-vertical-relative:text;v-text-anchor:top" coordsize="6650990,1270" o:gfxdata="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" path="m,l6650426,e" filled="f" strokecolor="#1d1d1d" strokeweight=".26456mm">
+              <v:shape w14:anchorId="2E7C600E" id="Graphic 27" o:spid="_x0000_s1026" style="position:absolute;margin-left:36.85pt;margin-top:4.75pt;width:523.7pt;height:.1pt;z-index:-251657728;visibility:visible;mso-wrap-style:square;mso-wrap-distance-left:0;mso-wrap-distance-top:0;mso-wrap-distance-right:0;mso-wrap-distance-bottom:0;mso-position-horizontal:absolute;mso-position-horizontal-relative:page;mso-position-vertical:absolute;mso-position-vertical-relative:text;v-text-anchor:top" coordsize="6650990,1270" o:gfxdata="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" path="m,l6650426,e" filled="f" strokecolor="#1d1d1d" strokeweight=".26456mm">
                 <v:path arrowok="t"/>
                 <w10:wrap type="topAndBottom" anchorx="page"/>
               </v:shape>
@@ -2137,7 +2135,7 @@
           </mc:Choice>
           <mc:Fallback>
             <w:pict>
-              <v:shape w14:anchorId="255DA50C" id="Graphic 34" o:spid="_x0000_s1026" style="position:absolute;margin-left:36.85pt;margin-top:4.05pt;width:523.7pt;height:.1pt;z-index:-251643904;visibility:visible;mso-wrap-style:square;mso-wrap-distance-left:0;mso-wrap-distance-top:0;mso-wrap-distance-right:0;mso-wrap-distance-bottom:0;mso-position-horizontal:absolute;mso-position-horizontal-relative:page;mso-position-vertical:absolute;mso-position-vertical-relative:text;v-text-anchor:top" coordsize="6650990,1270" o:gfxdata="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" path="m,l6650426,e" filled="f" strokecolor="#1d1d1d" strokeweight=".26456mm">
+              <v:shape w14:anchorId="3E56D4F3" id="Graphic 34" o:spid="_x0000_s1026" style="position:absolute;margin-left:36.85pt;margin-top:4.05pt;width:523.7pt;height:.1pt;z-index:-251643904;visibility:visible;mso-wrap-style:square;mso-wrap-distance-left:0;mso-wrap-distance-top:0;mso-wrap-distance-right:0;mso-wrap-distance-bottom:0;mso-position-horizontal:absolute;mso-position-horizontal-relative:page;mso-position-vertical:absolute;mso-position-vertical-relative:text;v-text-anchor:top" coordsize="6650990,1270" o:gfxdata="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" path="m,l6650426,e" filled="f" strokecolor="#1d1d1d" strokeweight=".26456mm">
                 <v:path arrowok="t"/>
                 <w10:wrap type="topAndBottom" anchorx="page"/>
               </v:shape>

</xml_diff>

<commit_message>
change root index.html path
</commit_message>
<xml_diff>
--- a/Soc/assets/docs/CV-DJIBO-Mamadou-EN.docx
+++ b/Soc/assets/docs/CV-DJIBO-Mamadou-EN.docx
@@ -148,7 +148,7 @@
           </mc:Choice>
           <mc:Fallback>
             <w:pict>
-              <v:shape w14:anchorId="1846860D" id="Graphic 1" o:spid="_x0000_s1026" style="position:absolute;margin-left:35.45pt;margin-top:6.4pt;width:523.7pt;height:.1pt;z-index:-251674624;visibility:visible;mso-wrap-style:square;mso-wrap-distance-left:0;mso-wrap-distance-top:0;mso-wrap-distance-right:0;mso-wrap-distance-bottom:0;mso-position-horizontal:absolute;mso-position-horizontal-relative:page;mso-position-vertical:absolute;mso-position-vertical-relative:text;v-text-anchor:top" coordsize="6650990,1270" o:gfxdata="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" path="m,l6650426,e" filled="f" strokecolor="#1d1d1d" strokeweight=".26456mm">
+              <v:shape w14:anchorId="3B2E973C" id="Graphic 1" o:spid="_x0000_s1026" style="position:absolute;margin-left:35.45pt;margin-top:6.4pt;width:523.7pt;height:.1pt;z-index:-251674624;visibility:visible;mso-wrap-style:square;mso-wrap-distance-left:0;mso-wrap-distance-top:0;mso-wrap-distance-right:0;mso-wrap-distance-bottom:0;mso-position-horizontal:absolute;mso-position-horizontal-relative:page;mso-position-vertical:absolute;mso-position-vertical-relative:text;v-text-anchor:top" coordsize="6650990,1270" o:gfxdata="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" path="m,l6650426,e" filled="f" strokecolor="#1d1d1d" strokeweight=".26456mm">
                 <v:path arrowok="t"/>
                 <w10:wrap type="topAndBottom" anchorx="page"/>
               </v:shape>
@@ -390,7 +390,7 @@
           </mc:Choice>
           <mc:Fallback>
             <w:pict>
-              <v:shape w14:anchorId="3876D452" id="Graphic 2" o:spid="_x0000_s1026" style="position:absolute;margin-left:35.45pt;margin-top:1.85pt;width:523.7pt;height:.1pt;z-index:-251670528;visibility:visible;mso-wrap-style:square;mso-wrap-distance-left:0;mso-wrap-distance-top:0;mso-wrap-distance-right:0;mso-wrap-distance-bottom:0;mso-position-horizontal:absolute;mso-position-horizontal-relative:page;mso-position-vertical:absolute;mso-position-vertical-relative:text;v-text-anchor:top" coordsize="6650990,1270" o:gfxdata="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" path="m,l6650426,e" filled="f" strokecolor="#1d1d1d" strokeweight=".26456mm">
+              <v:shape w14:anchorId="05A0578A" id="Graphic 2" o:spid="_x0000_s1026" style="position:absolute;margin-left:35.45pt;margin-top:1.85pt;width:523.7pt;height:.1pt;z-index:-251670528;visibility:visible;mso-wrap-style:square;mso-wrap-distance-left:0;mso-wrap-distance-top:0;mso-wrap-distance-right:0;mso-wrap-distance-bottom:0;mso-position-horizontal:absolute;mso-position-horizontal-relative:page;mso-position-vertical:absolute;mso-position-vertical-relative:text;v-text-anchor:top" coordsize="6650990,1270" o:gfxdata="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" path="m,l6650426,e" filled="f" strokecolor="#1d1d1d" strokeweight=".26456mm">
                 <v:path arrowok="t"/>
                 <w10:wrap type="topAndBottom" anchorx="page"/>
               </v:shape>
@@ -545,7 +545,7 @@
           </mc:Choice>
           <mc:Fallback>
             <w:pict>
-              <v:group w14:anchorId="6FF3C137" id="Group 3" o:spid="_x0000_s1026" style="width:523.7pt;height:.75pt;mso-position-horizontal-relative:char;mso-position-vertical-relative:line" coordsize="66509,95" o:gfxdata="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">
+              <v:group w14:anchorId="076718BE" id="Group 3" o:spid="_x0000_s1026" style="width:523.7pt;height:.75pt;mso-position-horizontal-relative:char;mso-position-vertical-relative:line" coordsize="66509,95" o:gfxdata="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">
                 <v:shape id="Graphic 4" o:spid="_x0000_s1027" style="position:absolute;top:47;width:66509;height:13;visibility:visible;mso-wrap-style:square;v-text-anchor:top" coordsize="6650990,1270" o:gfxdata="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" path="m,l6650426,e" filled="f" strokecolor="#1d1d1d" strokeweight=".26456mm">
                   <v:path arrowok="t"/>
                 </v:shape>
@@ -852,7 +852,7 @@
           </mc:Choice>
           <mc:Fallback>
             <w:pict>
-              <v:shape w14:anchorId="4D27036E" id="Graphic 8" o:spid="_x0000_s1026" style="position:absolute;margin-left:35.45pt;margin-top:17.9pt;width:523.65pt;height:.1pt;z-index:-251662336;visibility:visible;mso-wrap-style:square;mso-wrap-distance-left:0;mso-wrap-distance-top:0;mso-wrap-distance-right:0;mso-wrap-distance-bottom:0;mso-position-horizontal:absolute;mso-position-horizontal-relative:page;mso-position-vertical:absolute;mso-position-vertical-relative:text;v-text-anchor:top" coordsize="6650355,1270" o:gfxdata="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" path="m,l6650352,e" filled="f" strokecolor="#1d1d1d" strokeweight=".26456mm">
+              <v:shape w14:anchorId="6985530B" id="Graphic 8" o:spid="_x0000_s1026" style="position:absolute;margin-left:35.45pt;margin-top:17.9pt;width:523.65pt;height:.1pt;z-index:-251662336;visibility:visible;mso-wrap-style:square;mso-wrap-distance-left:0;mso-wrap-distance-top:0;mso-wrap-distance-right:0;mso-wrap-distance-bottom:0;mso-position-horizontal:absolute;mso-position-horizontal-relative:page;mso-position-vertical:absolute;mso-position-vertical-relative:text;v-text-anchor:top" coordsize="6650355,1270" o:gfxdata="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" path="m,l6650352,e" filled="f" strokecolor="#1d1d1d" strokeweight=".26456mm">
                 <v:path arrowok="t"/>
                 <w10:wrap type="topAndBottom" anchorx="page"/>
               </v:shape>
@@ -1832,7 +1832,7 @@
           </mc:Choice>
           <mc:Fallback>
             <w:pict>
-              <v:shape w14:anchorId="2E7C600E" id="Graphic 27" o:spid="_x0000_s1026" style="position:absolute;margin-left:36.85pt;margin-top:4.75pt;width:523.7pt;height:.1pt;z-index:-251657728;visibility:visible;mso-wrap-style:square;mso-wrap-distance-left:0;mso-wrap-distance-top:0;mso-wrap-distance-right:0;mso-wrap-distance-bottom:0;mso-position-horizontal:absolute;mso-position-horizontal-relative:page;mso-position-vertical:absolute;mso-position-vertical-relative:text;v-text-anchor:top" coordsize="6650990,1270" o:gfxdata="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" path="m,l6650426,e" filled="f" strokecolor="#1d1d1d" strokeweight=".26456mm">
+              <v:shape w14:anchorId="5C94C0AD" id="Graphic 27" o:spid="_x0000_s1026" style="position:absolute;margin-left:36.85pt;margin-top:4.75pt;width:523.7pt;height:.1pt;z-index:-251657728;visibility:visible;mso-wrap-style:square;mso-wrap-distance-left:0;mso-wrap-distance-top:0;mso-wrap-distance-right:0;mso-wrap-distance-bottom:0;mso-position-horizontal:absolute;mso-position-horizontal-relative:page;mso-position-vertical:absolute;mso-position-vertical-relative:text;v-text-anchor:top" coordsize="6650990,1270" o:gfxdata="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" path="m,l6650426,e" filled="f" strokecolor="#1d1d1d" strokeweight=".26456mm">
                 <v:path arrowok="t"/>
                 <w10:wrap type="topAndBottom" anchorx="page"/>
               </v:shape>
@@ -2135,7 +2135,7 @@
           </mc:Choice>
           <mc:Fallback>
             <w:pict>
-              <v:shape w14:anchorId="3E56D4F3" id="Graphic 34" o:spid="_x0000_s1026" style="position:absolute;margin-left:36.85pt;margin-top:4.05pt;width:523.7pt;height:.1pt;z-index:-251643904;visibility:visible;mso-wrap-style:square;mso-wrap-distance-left:0;mso-wrap-distance-top:0;mso-wrap-distance-right:0;mso-wrap-distance-bottom:0;mso-position-horizontal:absolute;mso-position-horizontal-relative:page;mso-position-vertical:absolute;mso-position-vertical-relative:text;v-text-anchor:top" coordsize="6650990,1270" o:gfxdata="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" path="m,l6650426,e" filled="f" strokecolor="#1d1d1d" strokeweight=".26456mm">
+              <v:shape w14:anchorId="68F86BC7" id="Graphic 34" o:spid="_x0000_s1026" style="position:absolute;margin-left:36.85pt;margin-top:4.05pt;width:523.7pt;height:.1pt;z-index:-251643904;visibility:visible;mso-wrap-style:square;mso-wrap-distance-left:0;mso-wrap-distance-top:0;mso-wrap-distance-right:0;mso-wrap-distance-bottom:0;mso-position-horizontal:absolute;mso-position-horizontal-relative:page;mso-position-vertical:absolute;mso-position-vertical-relative:text;v-text-anchor:top" coordsize="6650990,1270" o:gfxdata="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" path="m,l6650426,e" filled="f" strokecolor="#1d1d1d" strokeweight=".26456mm">
                 <v:path arrowok="t"/>
                 <w10:wrap type="topAndBottom" anchorx="page"/>
               </v:shape>

</xml_diff>